<commit_message>
cover letter of E&E
</commit_message>
<xml_diff>
--- a/docs/manuscript/cover_letter.docx
+++ b/docs/manuscript/cover_letter.docx
@@ -47,19 +47,7 @@
         <w:rPr>
           <w:rFonts w:ascii="Times New Roman" w:hAnsi="Times New Roman" w:cs="Times New Roman"/>
         </w:rPr>
-        <w:t>July</w:t>
-      </w:r>
-      <w:r>
-        <w:rPr>
-          <w:rFonts w:ascii="Times New Roman" w:hAnsi="Times New Roman" w:cs="Times New Roman"/>
-        </w:rPr>
-        <w:t xml:space="preserve"> 28</w:t>
-      </w:r>
-      <w:r>
-        <w:rPr>
-          <w:rFonts w:ascii="Times New Roman" w:hAnsi="Times New Roman" w:cs="Times New Roman"/>
-        </w:rPr>
-        <w:t>, 2025</w:t>
+        <w:t>March 4, 2026</w:t>
       </w:r>
     </w:p>
     <w:p>
@@ -675,7 +663,63 @@
         <w:rPr>
           <w:rFonts w:ascii="Times New Roman" w:hAnsi="Times New Roman" w:cs="Times New Roman"/>
         </w:rPr>
-        <w:t xml:space="preserve">To showcase the utility of hatchR, our manuscript presents three case studies. Our fist example </w:t>
+        <w:t xml:space="preserve">Explicitly, our goal with this manuscript is to demonstrate how a recently developed tool specific to fishes could be applied to much broader array of taxa </w:t>
+      </w:r>
+      <w:r>
+        <w:rPr>
+          <w:rFonts w:ascii="Times New Roman" w:hAnsi="Times New Roman" w:cs="Times New Roman"/>
+        </w:rPr>
+        <w:t xml:space="preserve">for which </w:t>
+      </w:r>
+      <w:r>
+        <w:rPr>
+          <w:rFonts w:ascii="Times New Roman" w:hAnsi="Times New Roman" w:cs="Times New Roman"/>
+        </w:rPr>
+        <w:t xml:space="preserve">it was originally developed. As such, the manuscript lands somewhere between a Method </w:t>
+      </w:r>
+      <w:r>
+        <w:rPr>
+          <w:rFonts w:ascii="Times New Roman" w:hAnsi="Times New Roman" w:cs="Times New Roman"/>
+        </w:rPr>
+        <w:t xml:space="preserve">paper </w:t>
+      </w:r>
+      <w:r>
+        <w:rPr>
+          <w:rFonts w:ascii="Times New Roman" w:hAnsi="Times New Roman" w:cs="Times New Roman"/>
+        </w:rPr>
+        <w:t xml:space="preserve">and Software </w:t>
+      </w:r>
+      <w:r>
+        <w:rPr>
+          <w:rFonts w:ascii="Times New Roman" w:hAnsi="Times New Roman" w:cs="Times New Roman"/>
+        </w:rPr>
+        <w:t>note</w:t>
+      </w:r>
+      <w:r>
+        <w:rPr>
+          <w:rFonts w:ascii="Times New Roman" w:hAnsi="Times New Roman" w:cs="Times New Roman"/>
+        </w:rPr>
+        <w:t xml:space="preserve"> in the Research Article Manuscript Type, as discussed in Ecology and Evolution’s author guidelines. </w:t>
+      </w:r>
+      <w:r>
+        <w:rPr>
+          <w:rFonts w:ascii="Times New Roman" w:hAnsi="Times New Roman" w:cs="Times New Roman"/>
+        </w:rPr>
+        <w:t xml:space="preserve">To showcase the utility of </w:t>
+      </w:r>
+      <w:proofErr w:type="spellStart"/>
+      <w:r>
+        <w:rPr>
+          <w:rFonts w:ascii="Times New Roman" w:hAnsi="Times New Roman" w:cs="Times New Roman"/>
+        </w:rPr>
+        <w:t>hatchR</w:t>
+      </w:r>
+      <w:proofErr w:type="spellEnd"/>
+      <w:r>
+        <w:rPr>
+          <w:rFonts w:ascii="Times New Roman" w:hAnsi="Times New Roman" w:cs="Times New Roman"/>
+        </w:rPr>
+        <w:t xml:space="preserve">, our manuscript presents three case studies. Our fist example </w:t>
       </w:r>
       <w:r>
         <w:rPr>
@@ -1077,6 +1121,7 @@
         <w:rPr>
           <w:rFonts w:ascii="Times New Roman" w:hAnsi="Times New Roman" w:cs="Times New Roman"/>
         </w:rPr>
+        <w:lastRenderedPageBreak/>
         <w:t>Beyond the manuscript</w:t>
       </w:r>
       <w:r>
@@ -1173,7 +1218,13 @@
         <w:rPr>
           <w:rFonts w:ascii="Times New Roman" w:hAnsi="Times New Roman" w:cs="Times New Roman"/>
         </w:rPr>
-        <w:t xml:space="preserve"> 3,475</w:t>
+        <w:t xml:space="preserve"> 3,</w:t>
+      </w:r>
+      <w:r>
+        <w:rPr>
+          <w:rFonts w:ascii="Times New Roman" w:hAnsi="Times New Roman" w:cs="Times New Roman"/>
+        </w:rPr>
+        <w:t>996</w:t>
       </w:r>
       <w:r>
         <w:rPr>
@@ -1557,18 +1608,6 @@
           <w:rFonts w:ascii="Times New Roman" w:hAnsi="Times New Roman" w:cs="Times New Roman"/>
         </w:rPr>
         <w:t>Universidad Austral de Chile</w:t>
-      </w:r>
-      <w:r>
-        <w:rPr>
-          <w:rFonts w:ascii="Times New Roman" w:hAnsi="Times New Roman" w:cs="Times New Roman"/>
-        </w:rPr>
-        <w:t xml:space="preserve">, </w:t>
-      </w:r>
-      <w:r>
-        <w:rPr>
-          <w:rFonts w:ascii="Times New Roman" w:hAnsi="Times New Roman" w:cs="Times New Roman"/>
-        </w:rPr>
-        <w:t>robertonespolo@uach.cl</w:t>
       </w:r>
     </w:p>
     <w:p>

</xml_diff>